<commit_message>
Add live Power BI report evidence to final submission
</commit_message>
<xml_diff>
--- a/docs/S4-I-18_Subhiksha_Thirunavukkarasu_FinalTermDoc.docx
+++ b/docs/S4-I-18_Subhiksha_Thirunavukkarasu_FinalTermDoc.docx
@@ -1048,7 +1048,7 @@
         <w:spacing w:before="60" w:after="80"/>
       </w:pPr>
       <w:r>
-        <w:t>FacilityIQ implements simulated three-domain devices, unified validation, a JSONL data lake mirrored to Azure Blob, feature pipelines, three scikit-learn models and a five-screen Streamlit portal. The direct-to-Blob path remains the working Azure fallback because corporate RBAC blocked IoT Hub, Functions and App Service provisioning. Final QA adds Great Expectations, Selenium browser journeys and Locust load testing. Three Power BI reports were not completed and are disclosed in Section 10.</w:t>
+        <w:t>FacilityIQ implements simulated three-domain devices, unified validation, a JSONL data lake mirrored to Azure Blob, feature pipelines, three scikit-learn models and a five-screen Streamlit portal. The direct-to-Blob path remains the working Azure fallback because corporate RBAC blocked IoT Hub, Functions and App Service provisioning. Final QA adds Great Expectations, Selenium browser journeys and Locust load testing. Three report-ready datasets were validated and used to create live Power BI Service reports for equipment health, energy consumption and space utilization.</w:t>
       </w:r>
     </w:p>
     <w:p xmlns:wp14="http://schemas.microsoft.com/office/word/2010/wordml" wp14:textId="77777777">
@@ -3017,7 +3017,7 @@
               <w:rPr>
                 <w:sz w:val="17"/>
               </w:rPr>
-              <w:t>Not Started</w:t>
+              <w:t>Done</w:t>
             </w:r>
           </w:p>
         </w:tc>
@@ -3046,7 +3046,7 @@
               <w:rPr>
                 <w:sz w:val="17"/>
               </w:rPr>
-              <w:t>N/A</w:t>
+              <w:t>EV-11</w:t>
             </w:r>
           </w:p>
         </w:tc>
@@ -3590,7 +3590,7 @@
               <w:rPr>
                 <w:sz w:val="17"/>
               </w:rPr>
-              <w:t>Partial</w:t>
+              <w:t>Done</w:t>
             </w:r>
           </w:p>
         </w:tc>
@@ -3619,7 +3619,7 @@
               <w:rPr>
                 <w:sz w:val="17"/>
               </w:rPr>
-              <w:t>EV-07–EV-09</w:t>
+              <w:t>EV-07–EV-11</w:t>
             </w:r>
           </w:p>
         </w:tc>
@@ -3817,7 +3817,7 @@
               <w:rPr>
                 <w:sz w:val="17"/>
               </w:rPr>
-              <w:t>82% — core telemetry, models, portal, AI and QA are working and evidenced. Missing Power BI dashboards and the corporate-RBAC-blocked IoT Hub/Functions/App Service path prevent a 100% claim.</w:t>
+              <w:t>88% — core telemetry, models, portal, AI, QA and three Power BI Service reports are working and evidenced. The corporate-access-blocked IoT Hub/Functions/App Service route prevents a 100% claim.</w:t>
             </w:r>
           </w:p>
         </w:tc>
@@ -5329,7 +5329,7 @@
               <w:rPr>
                 <w:sz w:val="17"/>
               </w:rPr>
-              <w:t>https://github.com/subhikshathirunavukkarasu0503/facilityiq/tree/3bac9f2c5e0b956f39047f166ddbdf8275e3a62a/docs/evidence/final</w:t>
+              <w:t>https://github.com/subhikshathirunavukkarasu0503/facilityiq/tree/ae4a8b4df6493998431db7f1c29786b9c15fd6fa/docs/evidence/final</w:t>
             </w:r>
           </w:p>
         </w:tc>
@@ -5491,7 +5491,7 @@
               <w:rPr>
                 <w:sz w:val="17"/>
               </w:rPr>
-              <w:t>https://github.com/subhikshathirunavukkarasu0503/facilityiq/tree/3bac9f2c5e0b956f39047f166ddbdf8275e3a62a/docs/evidence/final</w:t>
+              <w:t>https://github.com/subhikshathirunavukkarasu0503/facilityiq/tree/ae4a8b4df6493998431db7f1c29786b9c15fd6fa/docs/evidence/final</w:t>
             </w:r>
           </w:p>
         </w:tc>
@@ -5653,7 +5653,7 @@
               <w:rPr>
                 <w:sz w:val="17"/>
               </w:rPr>
-              <w:t>https://github.com/subhikshathirunavukkarasu0503/facilityiq/tree/3bac9f2c5e0b956f39047f166ddbdf8275e3a62a/docs/evidence/final</w:t>
+              <w:t>https://github.com/subhikshathirunavukkarasu0503/facilityiq/tree/ae4a8b4df6493998431db7f1c29786b9c15fd6fa/docs/evidence/final</w:t>
             </w:r>
           </w:p>
         </w:tc>
@@ -5757,7 +5757,7 @@
               <w:rPr>
                 <w:sz w:val="17"/>
               </w:rPr>
-              <w:t>Final source/evidence commit 3bac9f2</w:t>
+              <w:t>Final source/evidence commit and Power BI datasets</w:t>
             </w:r>
           </w:p>
         </w:tc>
@@ -5786,7 +5786,7 @@
               <w:rPr>
                 <w:sz w:val="17"/>
               </w:rPr>
-              <w:t>D-10–D-12</w:t>
+              <w:t>D-09–D-12</w:t>
             </w:r>
           </w:p>
         </w:tc>
@@ -5815,7 +5815,7 @@
               <w:rPr>
                 <w:sz w:val="17"/>
               </w:rPr>
-              <w:t>https://github.com/subhikshathirunavukkarasu0503/facilityiq/commit/3bac9f2c5e0b956f39047f166ddbdf8275e3a62a</w:t>
+              <w:t>https://github.com/subhikshathirunavukkarasu0503/facilityiq/commit/ae4a8b4df6493998431db7f1c29786b9c15fd6fa</w:t>
             </w:r>
           </w:p>
         </w:tc>
@@ -5834,6 +5834,93 @@
               <w:bottom w:w="60" w:type="dxa"/>
               <w:right w:w="100" w:type="dxa"/>
             </w:tcMar>
+            <w:vAlign w:val="center"/>
+          </w:tcPr>
+          <w:p>
+            <w:pPr>
+              <w:spacing w:after="40"/>
+            </w:pPr>
+            <w:r>
+              <w:rPr>
+                <w:sz w:val="17"/>
+              </w:rPr>
+              <w:t>No — new</w:t>
+            </w:r>
+          </w:p>
+        </w:tc>
+      </w:tr>
+      <w:tr>
+        <w:tc>
+          <w:tcPr>
+            <w:tcW w:type="dxa" w:w="1000"/>
+            <w:vAlign w:val="center"/>
+          </w:tcPr>
+          <w:p>
+            <w:pPr>
+              <w:spacing w:after="40"/>
+            </w:pPr>
+            <w:r>
+              <w:rPr>
+                <w:sz w:val="17"/>
+              </w:rPr>
+              <w:t>EV-11</w:t>
+            </w:r>
+          </w:p>
+        </w:tc>
+        <w:tc>
+          <w:tcPr>
+            <w:tcW w:type="dxa" w:w="3546"/>
+            <w:vAlign w:val="center"/>
+          </w:tcPr>
+          <w:p>
+            <w:pPr>
+              <w:spacing w:after="40"/>
+            </w:pPr>
+            <w:r>
+              <w:rPr>
+                <w:sz w:val="17"/>
+              </w:rPr>
+              <w:t>Three live Power BI Service reports and semantic models</w:t>
+            </w:r>
+          </w:p>
+        </w:tc>
+        <w:tc>
+          <w:tcPr>
+            <w:tcW w:type="dxa" w:w="1400"/>
+            <w:vAlign w:val="center"/>
+          </w:tcPr>
+          <w:p>
+            <w:pPr>
+              <w:spacing w:after="40"/>
+            </w:pPr>
+            <w:r>
+              <w:rPr>
+                <w:sz w:val="17"/>
+              </w:rPr>
+              <w:t>D-09</w:t>
+            </w:r>
+          </w:p>
+        </w:tc>
+        <w:tc>
+          <w:tcPr>
+            <w:tcW w:type="dxa" w:w="2100"/>
+            <w:vAlign w:val="center"/>
+          </w:tcPr>
+          <w:p>
+            <w:pPr>
+              <w:spacing w:after="40"/>
+            </w:pPr>
+            <w:r>
+              <w:rPr>
+                <w:sz w:val="17"/>
+              </w:rPr>
+              <w:t>https://github.com/subhikshathirunavukkarasu0503/facilityiq/tree/ae4a8b4df6493998431db7f1c29786b9c15fd6fa/docs/evidence/final</w:t>
+            </w:r>
+          </w:p>
+        </w:tc>
+        <w:tc>
+          <w:tcPr>
+            <w:tcW w:type="dxa" w:w="1700"/>
             <w:vAlign w:val="center"/>
           </w:tcPr>
           <w:p>
@@ -6206,7 +6293,7 @@
               <w:rPr>
                 <w:sz w:val="17"/>
               </w:rPr>
-              <w:t>https://github.com/subhikshathirunavukkarasu0503/facilityiq/tree/3bac9f2c5e0b956f39047f166ddbdf8275e3a62a/docs/evidence/final</w:t>
+              <w:t>https://github.com/subhikshathirunavukkarasu0503/facilityiq/tree/ae4a8b4df6493998431db7f1c29786b9c15fd6fa/docs/evidence/final</w:t>
             </w:r>
           </w:p>
         </w:tc>
@@ -6681,7 +6768,7 @@
               <w:rPr>
                 <w:sz w:val="17"/>
               </w:rPr>
-              <w:t>https://github.com/subhikshathirunavukkarasu0503/facilityiq/tree/3bac9f2c5e0b956f39047f166ddbdf8275e3a62a/docs/evidence/final</w:t>
+              <w:t>https://github.com/subhikshathirunavukkarasu0503/facilityiq/tree/ae4a8b4df6493998431db7f1c29786b9c15fd6fa/docs/evidence/final</w:t>
             </w:r>
           </w:p>
         </w:tc>
@@ -6916,7 +7003,7 @@
               <w:rPr>
                 <w:sz w:val="17"/>
               </w:rPr>
-              <w:t>Confirms current held-out model metrics and explicitly separates delivered scope from corporate-RBAC-blocked cloud components and missing Power BI dashboards.</w:t>
+              <w:t>Confirms current held-out model metrics and explicitly separates delivered scope from cloud components blocked during the final Azure validation attempt.</w:t>
             </w:r>
           </w:p>
         </w:tc>
@@ -7156,7 +7243,7 @@
               <w:rPr>
                 <w:sz w:val="17"/>
               </w:rPr>
-              <w:t>https://github.com/subhikshathirunavukkarasu0503/facilityiq/tree/3bac9f2c5e0b956f39047f166ddbdf8275e3a62a/docs/evidence/final</w:t>
+              <w:t>https://github.com/subhikshathirunavukkarasu0503/facilityiq/tree/ae4a8b4df6493998431db7f1c29786b9c15fd6fa/docs/evidence/final</w:t>
             </w:r>
           </w:p>
         </w:tc>
@@ -7292,7 +7379,7 @@
         <w:spacing w:before="260" w:after="80"/>
       </w:pPr>
       <w:r>
-        <w:t>EV-10 — Final source and evidence commit</w:t>
+        <w:t>EV-10 — Final source, evidence and dataset commits</w:t>
       </w:r>
     </w:p>
     <w:tbl>
@@ -7391,7 +7478,7 @@
               <w:rPr>
                 <w:sz w:val="17"/>
               </w:rPr>
-              <w:t>Commit 3bac9f2 adds the Great Expectations validator, Locust profile, Selenium journeys, tests and raw result files.</w:t>
+              <w:t>Commits 3bac9f2 through ae4a8b4 add the Great Expectations validator, Locust profile, Selenium journeys, tests, raw result files and three validated Power BI datasets.</w:t>
             </w:r>
           </w:p>
         </w:tc>
@@ -7631,7 +7718,7 @@
               <w:rPr>
                 <w:sz w:val="17"/>
               </w:rPr>
-              <w:t>https://github.com/subhikshathirunavukkarasu0503/facilityiq/commit/3bac9f2c5e0b956f39047f166ddbdf8275e3a62a</w:t>
+              <w:t>https://github.com/subhikshathirunavukkarasu0503/facilityiq/commit/ae4a8b4df6493998431db7f1c29786b9c15fd6fa</w:t>
             </w:r>
           </w:p>
         </w:tc>
@@ -7727,7 +7814,7 @@
         <w:spacing w:before="260" w:after="80"/>
       </w:pPr>
       <w:r>
-        <w:t>EV-11 — Not used</w:t>
+        <w:t>EV-11 — Three Power BI Service reports</w:t>
       </w:r>
     </w:p>
     <w:tbl>
@@ -7826,7 +7913,7 @@
               <w:rPr>
                 <w:sz w:val="17"/>
               </w:rPr>
-              <w:t>No additional evidence claimed.</w:t>
+              <w:t>Live reports and semantic models were created in My workspace for Equipment Health, Energy Consumption and Space Utilization. Each report contains a real table visual built from the validated CSV export.</w:t>
             </w:r>
           </w:p>
         </w:tc>
@@ -7906,7 +7993,7 @@
               <w:rPr>
                 <w:sz w:val="17"/>
               </w:rPr>
-              <w:t>N/A</w:t>
+              <w:t>D-09</w:t>
             </w:r>
           </w:p>
         </w:tc>
@@ -7986,7 +8073,7 @@
               <w:rPr>
                 <w:sz w:val="17"/>
               </w:rPr>
-              <w:t>N/A</w:t>
+              <w:t>21-Sep-2026</w:t>
             </w:r>
           </w:p>
         </w:tc>
@@ -8066,7 +8153,7 @@
               <w:rPr>
                 <w:sz w:val="17"/>
               </w:rPr>
-              <w:t>N/A</w:t>
+              <w:t>Equipment: https://app.powerbi.com/groups/me/reports/ced34aee-008a-46a2-b0fa-ffb1a9b85d80?experience=power-bi ; Energy: https://app.powerbi.com/groups/me/reports/e09268d2-7f5d-4518-bab2-1fd9f39734f2?experience=power-bi ; Space: https://app.powerbi.com/groups/me/reports/388c3a7f-1caf-469b-a779-da2b1d136041?experience=power-bi</w:t>
             </w:r>
           </w:p>
         </w:tc>
@@ -8146,12 +8233,52 @@
               <w:rPr>
                 <w:sz w:val="17"/>
               </w:rPr>
-              <w:t>☑ No (not used)</w:t>
+              <w:t>☑ No (new / progressed)</w:t>
             </w:r>
           </w:p>
         </w:tc>
       </w:tr>
     </w:tbl>
+    <w:p>
+      <w:pPr>
+        <w:spacing w:after="80"/>
+        <w:jc w:val="center"/>
+      </w:pPr>
+      <w:r>
+        <w:drawing>
+          <wp:inline xmlns:a="http://schemas.openxmlformats.org/drawingml/2006/main" xmlns:pic="http://schemas.openxmlformats.org/drawingml/2006/picture">
+            <wp:extent cx="5943600" cy="10191526"/>
+            <wp:docPr id="4" name="Picture 4"/>
+            <wp:cNvGraphicFramePr>
+              <a:graphicFrameLocks noChangeAspect="1"/>
+            </wp:cNvGraphicFramePr>
+            <a:graphic>
+              <a:graphicData uri="http://schemas.openxmlformats.org/drawingml/2006/picture">
+                <pic:pic>
+                  <pic:nvPicPr>
+                    <pic:cNvPr id="0" name="ev11_powerbi_reports.png"/>
+                    <pic:cNvPicPr/>
+                  </pic:nvPicPr>
+                  <pic:blipFill>
+                    <a:blip r:embed="rId11"/>
+                    <a:stretch>
+                      <a:fillRect/>
+                    </a:stretch>
+                  </pic:blipFill>
+                  <pic:spPr>
+                    <a:xfrm>
+                      <a:off x="0" y="0"/>
+                      <a:ext cx="5943600" cy="10191526"/>
+                    </a:xfrm>
+                    <a:prstGeom prst="rect"/>
+                  </pic:spPr>
+                </pic:pic>
+              </a:graphicData>
+            </a:graphic>
+          </wp:inline>
+        </w:drawing>
+      </w:r>
+    </w:p>
     <w:p xmlns:wp14="http://schemas.microsoft.com/office/word/2010/wordml" wp14:textId="77777777">
       <w:pPr>
         <w:spacing w:before="0" w:after="80"/>
@@ -8764,7 +8891,7 @@
               <w:rPr>
                 <w:sz w:val="17"/>
               </w:rPr>
-              <w:t>3bac9f2c5e0b956f39047f166ddbdf8275e3a62a — 20-Sep-2026</w:t>
+              <w:t>ae4a8b4df6493998431db7f1c29786b9c15fd6fa — 20-Sep-2026</w:t>
             </w:r>
           </w:p>
         </w:tc>
@@ -8917,7 +9044,7 @@
               <w:rPr>
                 <w:sz w:val="17"/>
               </w:rPr>
-              <w:t>https://github.com/subhikshathirunavukkarasu0503/facilityiq/tree/3bac9f2c5e0b956f39047f166ddbdf8275e3a62a/docs/evidence/final</w:t>
+              <w:t>https://github.com/subhikshathirunavukkarasu0503/facilityiq/tree/ae4a8b4df6493998431db7f1c29786b9c15fd6fa/docs/evidence/final</w:t>
             </w:r>
           </w:p>
         </w:tc>
@@ -9173,7 +9300,7 @@
               <w:rPr>
                 <w:sz w:val="17"/>
               </w:rPr>
-              <w:t>main at commit 3bac9f2c5e0b956f39047f166ddbdf8275e3a62a</w:t>
+              <w:t>main at commit ae4a8b4df6493998431db7f1c29786b9c15fd6fa</w:t>
             </w:r>
           </w:p>
         </w:tc>
@@ -10422,7 +10549,7 @@
               <w:rPr>
                 <w:sz w:val="17"/>
               </w:rPr>
-              <w:t>Free / ₹0</w:t>
+              <w:t>F1 Free / ₹0</w:t>
             </w:r>
           </w:p>
         </w:tc>
@@ -10509,7 +10636,7 @@
               <w:rPr>
                 <w:sz w:val="17"/>
               </w:rPr>
-              <w:t>Creation blocked by corporate RBAC; client sink exists.</w:t>
+              <w:t>Draft validated to final review, then Azure returned a generic Validation failed; no resource was created.</w:t>
             </w:r>
           </w:p>
         </w:tc>
@@ -11338,7 +11465,7 @@
               <w:rPr>
                 <w:sz w:val="17"/>
               </w:rPr>
-              <w:t>Power BI Desktop</w:t>
+              <w:t>Power BI Service</w:t>
             </w:r>
           </w:p>
         </w:tc>
@@ -11355,7 +11482,7 @@
               <w:rPr>
                 <w:sz w:val="17"/>
               </w:rPr>
-              <w:t>Free</w:t>
+              <w:t>Free / existing organisational licence</w:t>
             </w:r>
           </w:p>
         </w:tc>
@@ -11372,7 +11499,7 @@
               <w:rPr>
                 <w:sz w:val="17"/>
               </w:rPr>
-              <w:t>No</w:t>
+              <w:t>Yes</w:t>
             </w:r>
           </w:p>
         </w:tc>
@@ -11406,7 +11533,7 @@
               <w:rPr>
                 <w:sz w:val="17"/>
               </w:rPr>
-              <w:t>Three dashboards not completed.</w:t>
+              <w:t>Three reports and three semantic models created in My workspace from validated CSV exports.</w:t>
             </w:r>
           </w:p>
         </w:tc>
@@ -13215,7 +13342,7 @@
               <w:rPr>
                 <w:sz w:val="17"/>
               </w:rPr>
-              <w:t>Not completed</w:t>
+              <w:t>Three live Power BI Service reports backed by validated CSV exports</w:t>
             </w:r>
           </w:p>
         </w:tc>
@@ -13244,7 +13371,7 @@
               <w:rPr>
                 <w:sz w:val="17"/>
               </w:rPr>
-              <w:t>Disclosed, not represented as delivered.</w:t>
+              <w:t>Completed on 21-Sep-2026; live URLs and screenshots recorded in EV-11.</w:t>
             </w:r>
           </w:p>
         </w:tc>
@@ -14840,7 +14967,7 @@
               <w:rPr>
                 <w:sz w:val="17"/>
               </w:rPr>
-              <w:t>Power BI dashboards x3</w:t>
+              <w:t>Public cloud portal access</w:t>
             </w:r>
           </w:p>
         </w:tc>
@@ -14869,7 +14996,7 @@
               <w:rPr>
                 <w:sz w:val="17"/>
               </w:rPr>
-              <w:t>No PBIX files or dashboard evidence exist in the repository</w:t>
+              <w:t>Current Streamlit URL redirects to Streamlit authentication</w:t>
             </w:r>
           </w:p>
         </w:tc>
@@ -14898,7 +15025,7 @@
               <w:rPr>
                 <w:sz w:val="17"/>
               </w:rPr>
-              <w:t>Y</w:t>
+              <w:t>N</w:t>
             </w:r>
           </w:p>
         </w:tc>
@@ -14927,7 +15054,7 @@
               <w:rPr>
                 <w:sz w:val="17"/>
               </w:rPr>
-              <w:t>Build Equipment Health, Energy and Space reports from exported lake datasets.</w:t>
+              <w:t>Change sharing settings or grant reviewer access before review.</w:t>
             </w:r>
           </w:p>
         </w:tc>
@@ -14973,7 +15100,7 @@
               <w:rPr>
                 <w:sz w:val="17"/>
               </w:rPr>
-              <w:t>Public cloud portal access</w:t>
+              <w:t>Official Mid-Term result/feedback and final review dates</w:t>
             </w:r>
           </w:p>
         </w:tc>
@@ -15002,7 +15129,7 @@
               <w:rPr>
                 <w:sz w:val="17"/>
               </w:rPr>
-              <w:t>Current Streamlit URL redirects to Streamlit authentication</w:t>
+              <w:t>Not supplied with project materials</w:t>
             </w:r>
           </w:p>
         </w:tc>
@@ -15050,76 +15177,6 @@
               <w:bottom w:w="60" w:type="dxa"/>
               <w:right w:w="100" w:type="dxa"/>
             </w:tcMar>
-            <w:vAlign w:val="center"/>
-          </w:tcPr>
-          <w:p>
-            <w:pPr>
-              <w:spacing w:after="40"/>
-            </w:pPr>
-            <w:r>
-              <w:rPr>
-                <w:sz w:val="17"/>
-              </w:rPr>
-              <w:t>Change sharing settings or grant reviewer access before review.</w:t>
-            </w:r>
-          </w:p>
-        </w:tc>
-      </w:tr>
-      <w:tr>
-        <w:tc>
-          <w:tcPr>
-            <w:tcW w:type="dxa" w:w="3200"/>
-            <w:vAlign w:val="center"/>
-          </w:tcPr>
-          <w:p>
-            <w:pPr>
-              <w:spacing w:after="40"/>
-            </w:pPr>
-            <w:r>
-              <w:rPr>
-                <w:sz w:val="17"/>
-              </w:rPr>
-              <w:t>Official Mid-Term result/feedback and final review dates</w:t>
-            </w:r>
-          </w:p>
-        </w:tc>
-        <w:tc>
-          <w:tcPr>
-            <w:tcW w:type="dxa" w:w="2200"/>
-            <w:vAlign w:val="center"/>
-          </w:tcPr>
-          <w:p>
-            <w:pPr>
-              <w:spacing w:after="40"/>
-            </w:pPr>
-            <w:r>
-              <w:rPr>
-                <w:sz w:val="17"/>
-              </w:rPr>
-              <w:t>Not supplied with project materials</w:t>
-            </w:r>
-          </w:p>
-        </w:tc>
-        <w:tc>
-          <w:tcPr>
-            <w:tcW w:type="dxa" w:w="1500"/>
-            <w:vAlign w:val="center"/>
-          </w:tcPr>
-          <w:p>
-            <w:pPr>
-              <w:spacing w:after="40"/>
-            </w:pPr>
-            <w:r>
-              <w:rPr>
-                <w:sz w:val="17"/>
-              </w:rPr>
-              <w:t>N</w:t>
-            </w:r>
-          </w:p>
-        </w:tc>
-        <w:tc>
-          <w:tcPr>
-            <w:tcW w:type="dxa" w:w="2846"/>
             <w:vAlign w:val="center"/>
           </w:tcPr>
           <w:p>
@@ -15372,7 +15429,7 @@
               <w:rPr>
                 <w:sz w:val="17"/>
               </w:rPr>
-              <w:t>Corporate Azure RBAC blocks IoT Hub/App Service</w:t>
+              <w:t>Azure subscription validation blocks IoT Hub/App Service</w:t>
             </w:r>
           </w:p>
         </w:tc>
@@ -15430,7 +15487,7 @@
               <w:rPr>
                 <w:sz w:val="17"/>
               </w:rPr>
-              <w:t>Direct-Blob and local/Streamlit fallbacks retained; blocked items disclosed.</w:t>
+              <w:t>Direct-Blob and local/Streamlit fallbacks retained; the final IoT Hub attempt returned a generic validation failure and created no resource.</w:t>
             </w:r>
           </w:p>
         </w:tc>
@@ -15744,7 +15801,7 @@
               <w:rPr>
                 <w:sz w:val="17"/>
               </w:rPr>
-              <w:t>Dashboard gap</w:t>
+              <w:t>Power BI report depth</w:t>
             </w:r>
           </w:p>
         </w:tc>
@@ -15761,7 +15818,7 @@
               <w:rPr>
                 <w:sz w:val="17"/>
               </w:rPr>
-              <w:t>Realised</w:t>
+              <w:t>Mitigated</w:t>
             </w:r>
           </w:p>
         </w:tc>
@@ -15778,7 +15835,7 @@
               <w:rPr>
                 <w:sz w:val="17"/>
               </w:rPr>
-              <w:t>Disclosed rather than fabricating PBIX/dashboard evidence.</w:t>
+              <w:t>Created three live reports with table visuals and retained validated source datasets.</w:t>
             </w:r>
           </w:p>
         </w:tc>
@@ -15795,7 +15852,7 @@
               <w:rPr>
                 <w:sz w:val="17"/>
               </w:rPr>
-              <w:t>Three proposed analytics dashboards are absent.</w:t>
+              <w:t>Reports exist and are evidenced; further visual design remains optional refinement.</w:t>
             </w:r>
           </w:p>
         </w:tc>
@@ -16218,7 +16275,7 @@
               <w:rPr>
                 <w:sz w:val="17"/>
               </w:rPr>
-              <w:t>20-Sep-2026</w:t>
+              <w:t>21-Sep-2026</w:t>
             </w:r>
           </w:p>
         </w:tc>

</xml_diff>

<commit_message>
Correct final cloud status and live demo wording
</commit_message>
<xml_diff>
--- a/docs/S4-I-18_Subhiksha_Thirunavukkarasu_FinalTermDoc.docx
+++ b/docs/S4-I-18_Subhiksha_Thirunavukkarasu_FinalTermDoc.docx
@@ -1048,7 +1048,7 @@
         <w:spacing w:before="60" w:after="80"/>
       </w:pPr>
       <w:r>
-        <w:t>FacilityIQ implements simulated three-domain devices, unified validation, a JSONL data lake mirrored to Azure Blob, feature pipelines, three scikit-learn models and a five-screen Streamlit portal. The direct-to-Blob path remains the working Azure fallback because corporate RBAC blocked IoT Hub, Functions and App Service provisioning. Final QA adds Great Expectations, Selenium browser journeys and Locust load testing. Three report-ready datasets were validated and used to create live Power BI Service reports for equipment health, energy consumption and space utilization.</w:t>
+        <w:t>FacilityIQ implements simulated three-domain devices, unified validation, a JSONL data lake mirrored to Azure Blob, feature pipelines, three scikit-learn models and a five-screen Streamlit portal. The direct-to-Blob path remains the working Azure fallback because Azure validation/provisioning blocked IoT Hub, Functions and App Service; no new cloud resource was created. Final QA adds Great Expectations, Selenium browser journeys and Locust load testing. Three report-ready datasets were validated and used to create live Power BI Service reports for equipment health, energy consumption and space utilization.</w:t>
       </w:r>
     </w:p>
     <w:p xmlns:wp14="http://schemas.microsoft.com/office/word/2010/wordml" wp14:textId="77777777">
@@ -8967,7 +8967,7 @@
               <w:rPr>
                 <w:sz w:val="17"/>
               </w:rPr>
-              <w:t>https://facilityiq-subhiksha.streamlit.app — currently redirects to Streamlit authentication; local portal remains the demonstrable fallback</w:t>
+              <w:t>https://facilityiq-subhiksha.streamlit.app — live FacilityIQ sign-in portal; the free Streamlit app may sleep after inactivity and can be woken from its landing page. Local portal remains the fallback</w:t>
             </w:r>
           </w:p>
         </w:tc>
@@ -11122,7 +11122,7 @@
               <w:rPr>
                 <w:sz w:val="17"/>
               </w:rPr>
-              <w:t>Plan creation blocked by corporate RBAC; Streamlit fallback.</w:t>
+              <w:t>Azure App Service provisioning was blocked; no resource was created. Streamlit fallback is live.</w:t>
             </w:r>
           </w:p>
         </w:tc>
@@ -12972,7 +12972,7 @@
               <w:rPr>
                 <w:sz w:val="17"/>
               </w:rPr>
-              <w:t>Carried from Mid-Term; corporate RBAC blocked provisioning.</w:t>
+              <w:t>Final Azure validation/provisioning was blocked; no IoT Hub or Function resource was created.</w:t>
             </w:r>
           </w:p>
         </w:tc>
@@ -13209,7 +13209,7 @@
               <w:rPr>
                 <w:sz w:val="17"/>
               </w:rPr>
-              <w:t>Streamlit local/cloud fallback; cloud URL currently auth-gated</w:t>
+              <w:t>Live Streamlit cloud sign-in portal plus local fallback</w:t>
             </w:r>
           </w:p>
         </w:tc>
@@ -13238,7 +13238,7 @@
               <w:rPr>
                 <w:sz w:val="17"/>
               </w:rPr>
-              <w:t>Carried from Mid-Term; App Service plan blocked.</w:t>
+              <w:t>Azure App Service provisioning remained blocked; no resource was created.</w:t>
             </w:r>
           </w:p>
         </w:tc>
@@ -14730,7 +14730,7 @@
               <w:rPr>
                 <w:sz w:val="17"/>
               </w:rPr>
-              <w:t>Corporate Azure RBAC prevented resource creation</w:t>
+              <w:t>Azure validation/provisioning was blocked; no resource was created</w:t>
             </w:r>
           </w:p>
         </w:tc>
@@ -14863,7 +14863,7 @@
               <w:rPr>
                 <w:sz w:val="17"/>
               </w:rPr>
-              <w:t>Corporate RBAC prevented plan creation</w:t>
+              <w:t>Azure App Service provisioning was blocked; no resource was created</w:t>
             </w:r>
           </w:p>
         </w:tc>
@@ -14967,7 +14967,7 @@
               <w:rPr>
                 <w:sz w:val="17"/>
               </w:rPr>
-              <w:t>Public cloud portal access</w:t>
+              <w:t>Public cloud portal availability</w:t>
             </w:r>
           </w:p>
         </w:tc>
@@ -14996,7 +14996,7 @@
               <w:rPr>
                 <w:sz w:val="17"/>
               </w:rPr>
-              <w:t>Current Streamlit URL redirects to Streamlit authentication</w:t>
+              <w:t>Free Streamlit app can sleep after inactivity</w:t>
             </w:r>
           </w:p>
         </w:tc>
@@ -15054,7 +15054,7 @@
               <w:rPr>
                 <w:sz w:val="17"/>
               </w:rPr>
-              <w:t>Change sharing settings or grant reviewer access before review.</w:t>
+              <w:t>Wake the app before review; local portal remains the fallback.</w:t>
             </w:r>
           </w:p>
         </w:tc>
@@ -15429,7 +15429,7 @@
               <w:rPr>
                 <w:sz w:val="17"/>
               </w:rPr>
-              <w:t>Azure subscription validation blocks IoT Hub/App Service</w:t>
+              <w:t>Azure validation/provisioning blocks IoT Hub/App Service</w:t>
             </w:r>
           </w:p>
         </w:tc>

</xml_diff>